<commit_message>
Añadir texto de Agradecimientos
Incluye la dedicatoria de agradecimientos (a Natalia Louleli y Mikel
Iruskieta) en la página correspondiente. Regenerado el documento final
(.docx + PDF); los índices se rehornean y conservan la paginación.

Co-Authored-By: Claude Opus 4.8 <noreply@anthropic.com>
Claude-Session: https://claude.ai/code/session_01UjyyJrs77iMCnkNkxXFzXA
</commit_message>
<xml_diff>
--- a/entrega_TFM/TFM_Borja_Goni_Eguia_UNIR.docx
+++ b/entrega_TFM/TFM_Borja_Goni_Eguia_UNIR.docx
@@ -548,10 +548,20 @@
       <w:r>
         <w:br w:type="page"/>
       </w:r>
+      <w:r>
+        <w:rPr/>
+        <w:t>Agradecimientos</w:t>
+      </w:r>
+    </w:p>
+    <w:p>
+      <w:pPr>
+        <w:pStyle w:val="FirstParagraph"/>
+        <w:rPr/>
+      </w:pPr>
       <w:bookmarkStart w:id="1" w:name="agradecimientos"/>
       <w:r>
         <w:rPr/>
-        <w:t>Agradecimientos</w:t>
+        <w:t>Quiero agradecer a Natalia Louleli y a Mikel Iruskieta su tiempo y su trabajo desinteresado respondiendo a mis dudas, planteándome límites, recomendando lecturas y, sobre todo, por descubrirme la investigación como actividad complementaria a mi trabajo como profesor en Educación Secundaria.</w:t>
       </w:r>
       <w:bookmarkEnd w:id="1"/>
       <w:r>
@@ -679,7 +689,7 @@
             </w:rPr>
             <w:fldChar w:fldCharType="separate"/>
           </w:r>
-          <w:hyperlink w:anchor="__RefHeading___Toc1021_3103675090">
+          <w:hyperlink w:anchor="__RefHeading___Toc1022_1415579806">
             <w:bookmarkStart w:id="7" w:name="índice-de-contenidos"/>
             <w:bookmarkEnd w:id="7"/>
             <w:r>
@@ -702,7 +712,7 @@
             </w:tabs>
             <w:rPr/>
           </w:pPr>
-          <w:hyperlink w:anchor="__RefHeading___Toc1023_3103675090">
+          <w:hyperlink w:anchor="__RefHeading___Toc1024_1415579806">
             <w:r>
               <w:rPr>
                 <w:webHidden/>
@@ -723,7 +733,7 @@
             </w:tabs>
             <w:rPr/>
           </w:pPr>
-          <w:hyperlink w:anchor="__RefHeading___Toc1025_3103675090">
+          <w:hyperlink w:anchor="__RefHeading___Toc1026_1415579806">
             <w:r>
               <w:rPr>
                 <w:webHidden/>
@@ -744,7 +754,7 @@
             </w:tabs>
             <w:rPr/>
           </w:pPr>
-          <w:hyperlink w:anchor="__RefHeading___Toc1027_3103675090">
+          <w:hyperlink w:anchor="__RefHeading___Toc1028_1415579806">
             <w:r>
               <w:rPr>
                 <w:webHidden/>
@@ -765,7 +775,7 @@
             </w:tabs>
             <w:rPr/>
           </w:pPr>
-          <w:hyperlink w:anchor="__RefHeading___Toc1029_3103675090">
+          <w:hyperlink w:anchor="__RefHeading___Toc1030_1415579806">
             <w:r>
               <w:rPr>
                 <w:webHidden/>
@@ -786,7 +796,7 @@
             </w:tabs>
             <w:rPr/>
           </w:pPr>
-          <w:hyperlink w:anchor="__RefHeading___Toc1031_3103675090">
+          <w:hyperlink w:anchor="__RefHeading___Toc1032_1415579806">
             <w:r>
               <w:rPr>
                 <w:webHidden/>
@@ -807,7 +817,7 @@
             </w:tabs>
             <w:rPr/>
           </w:pPr>
-          <w:hyperlink w:anchor="__RefHeading___Toc1033_3103675090">
+          <w:hyperlink w:anchor="__RefHeading___Toc1034_1415579806">
             <w:r>
               <w:rPr>
                 <w:webHidden/>
@@ -828,7 +838,7 @@
             </w:tabs>
             <w:rPr/>
           </w:pPr>
-          <w:hyperlink w:anchor="__RefHeading___Toc1035_3103675090">
+          <w:hyperlink w:anchor="__RefHeading___Toc1036_1415579806">
             <w:r>
               <w:rPr>
                 <w:webHidden/>
@@ -849,7 +859,7 @@
             </w:tabs>
             <w:rPr/>
           </w:pPr>
-          <w:hyperlink w:anchor="__RefHeading___Toc1037_3103675090">
+          <w:hyperlink w:anchor="__RefHeading___Toc1038_1415579806">
             <w:r>
               <w:rPr>
                 <w:webHidden/>
@@ -870,7 +880,7 @@
             </w:tabs>
             <w:rPr/>
           </w:pPr>
-          <w:hyperlink w:anchor="__RefHeading___Toc1039_3103675090">
+          <w:hyperlink w:anchor="__RefHeading___Toc1040_1415579806">
             <w:r>
               <w:rPr>
                 <w:webHidden/>
@@ -891,7 +901,7 @@
             </w:tabs>
             <w:rPr/>
           </w:pPr>
-          <w:hyperlink w:anchor="__RefHeading___Toc1041_3103675090">
+          <w:hyperlink w:anchor="__RefHeading___Toc1042_1415579806">
             <w:r>
               <w:rPr>
                 <w:webHidden/>
@@ -912,7 +922,7 @@
             </w:tabs>
             <w:rPr/>
           </w:pPr>
-          <w:hyperlink w:anchor="__RefHeading___Toc1043_3103675090">
+          <w:hyperlink w:anchor="__RefHeading___Toc1044_1415579806">
             <w:r>
               <w:rPr>
                 <w:webHidden/>
@@ -933,7 +943,7 @@
             </w:tabs>
             <w:rPr/>
           </w:pPr>
-          <w:hyperlink w:anchor="__RefHeading___Toc1045_3103675090">
+          <w:hyperlink w:anchor="__RefHeading___Toc1046_1415579806">
             <w:r>
               <w:rPr>
                 <w:webHidden/>
@@ -954,7 +964,7 @@
             </w:tabs>
             <w:rPr/>
           </w:pPr>
-          <w:hyperlink w:anchor="__RefHeading___Toc1047_3103675090">
+          <w:hyperlink w:anchor="__RefHeading___Toc1048_1415579806">
             <w:r>
               <w:rPr>
                 <w:webHidden/>
@@ -975,7 +985,7 @@
             </w:tabs>
             <w:rPr/>
           </w:pPr>
-          <w:hyperlink w:anchor="__RefHeading___Toc1049_3103675090">
+          <w:hyperlink w:anchor="__RefHeading___Toc1050_1415579806">
             <w:r>
               <w:rPr>
                 <w:webHidden/>
@@ -996,7 +1006,7 @@
             </w:tabs>
             <w:rPr/>
           </w:pPr>
-          <w:hyperlink w:anchor="__RefHeading___Toc1051_3103675090">
+          <w:hyperlink w:anchor="__RefHeading___Toc1052_1415579806">
             <w:r>
               <w:rPr>
                 <w:webHidden/>
@@ -1017,7 +1027,7 @@
             </w:tabs>
             <w:rPr/>
           </w:pPr>
-          <w:hyperlink w:anchor="__RefHeading___Toc1053_3103675090">
+          <w:hyperlink w:anchor="__RefHeading___Toc1054_1415579806">
             <w:r>
               <w:rPr>
                 <w:webHidden/>
@@ -1038,7 +1048,7 @@
             </w:tabs>
             <w:rPr/>
           </w:pPr>
-          <w:hyperlink w:anchor="__RefHeading___Toc1055_3103675090">
+          <w:hyperlink w:anchor="__RefHeading___Toc1056_1415579806">
             <w:r>
               <w:rPr>
                 <w:webHidden/>
@@ -1059,7 +1069,7 @@
             </w:tabs>
             <w:rPr/>
           </w:pPr>
-          <w:hyperlink w:anchor="__RefHeading___Toc1057_3103675090">
+          <w:hyperlink w:anchor="__RefHeading___Toc1058_1415579806">
             <w:r>
               <w:rPr>
                 <w:webHidden/>
@@ -1080,7 +1090,7 @@
             </w:tabs>
             <w:rPr/>
           </w:pPr>
-          <w:hyperlink w:anchor="__RefHeading___Toc1059_3103675090">
+          <w:hyperlink w:anchor="__RefHeading___Toc1060_1415579806">
             <w:r>
               <w:rPr>
                 <w:webHidden/>
@@ -1101,7 +1111,7 @@
             </w:tabs>
             <w:rPr/>
           </w:pPr>
-          <w:hyperlink w:anchor="__RefHeading___Toc1061_3103675090">
+          <w:hyperlink w:anchor="__RefHeading___Toc1062_1415579806">
             <w:r>
               <w:rPr>
                 <w:webHidden/>
@@ -1122,7 +1132,7 @@
             </w:tabs>
             <w:rPr/>
           </w:pPr>
-          <w:hyperlink w:anchor="__RefHeading___Toc1063_3103675090">
+          <w:hyperlink w:anchor="__RefHeading___Toc1064_1415579806">
             <w:r>
               <w:rPr>
                 <w:webHidden/>
@@ -1143,7 +1153,7 @@
             </w:tabs>
             <w:rPr/>
           </w:pPr>
-          <w:hyperlink w:anchor="__RefHeading___Toc1065_3103675090">
+          <w:hyperlink w:anchor="__RefHeading___Toc1066_1415579806">
             <w:r>
               <w:rPr>
                 <w:webHidden/>
@@ -1164,7 +1174,7 @@
             </w:tabs>
             <w:rPr/>
           </w:pPr>
-          <w:hyperlink w:anchor="__RefHeading___Toc1067_3103675090">
+          <w:hyperlink w:anchor="__RefHeading___Toc1068_1415579806">
             <w:r>
               <w:rPr>
                 <w:webHidden/>
@@ -1185,7 +1195,7 @@
             </w:tabs>
             <w:rPr/>
           </w:pPr>
-          <w:hyperlink w:anchor="__RefHeading___Toc1069_3103675090">
+          <w:hyperlink w:anchor="__RefHeading___Toc1070_1415579806">
             <w:r>
               <w:rPr>
                 <w:webHidden/>
@@ -1206,7 +1216,7 @@
             </w:tabs>
             <w:rPr/>
           </w:pPr>
-          <w:hyperlink w:anchor="__RefHeading___Toc1071_3103675090">
+          <w:hyperlink w:anchor="__RefHeading___Toc1072_1415579806">
             <w:r>
               <w:rPr>
                 <w:webHidden/>
@@ -1227,7 +1237,7 @@
             </w:tabs>
             <w:rPr/>
           </w:pPr>
-          <w:hyperlink w:anchor="__RefHeading___Toc1073_3103675090">
+          <w:hyperlink w:anchor="__RefHeading___Toc1074_1415579806">
             <w:r>
               <w:rPr>
                 <w:webHidden/>
@@ -1248,7 +1258,7 @@
             </w:tabs>
             <w:rPr/>
           </w:pPr>
-          <w:hyperlink w:anchor="__RefHeading___Toc1075_3103675090">
+          <w:hyperlink w:anchor="__RefHeading___Toc1076_1415579806">
             <w:r>
               <w:rPr>
                 <w:webHidden/>
@@ -1269,7 +1279,7 @@
             </w:tabs>
             <w:rPr/>
           </w:pPr>
-          <w:hyperlink w:anchor="__RefHeading___Toc1077_3103675090">
+          <w:hyperlink w:anchor="__RefHeading___Toc1078_1415579806">
             <w:r>
               <w:rPr>
                 <w:webHidden/>
@@ -1290,7 +1300,7 @@
             </w:tabs>
             <w:rPr/>
           </w:pPr>
-          <w:hyperlink w:anchor="__RefHeading___Toc1079_3103675090">
+          <w:hyperlink w:anchor="__RefHeading___Toc1080_1415579806">
             <w:r>
               <w:rPr>
                 <w:webHidden/>
@@ -1360,7 +1370,7 @@
             </w:rPr>
             <w:fldChar w:fldCharType="separate"/>
           </w:r>
-          <w:hyperlink w:anchor="__RefHeading___Toc1081_3103675090">
+          <w:hyperlink w:anchor="__RefHeading___Toc1082_1415579806">
             <w:bookmarkStart w:id="9" w:name="índice-de-tablas"/>
             <w:bookmarkEnd w:id="9"/>
             <w:r>
@@ -1396,7 +1406,7 @@
             </w:tabs>
             <w:rPr/>
           </w:pPr>
-          <w:hyperlink w:anchor="__RefHeading___Toc1085_3103675090">
+          <w:hyperlink w:anchor="__RefHeading___Toc1086_1415579806">
             <w:r>
               <w:rPr>
                 <w:webHidden/>
@@ -1430,7 +1440,7 @@
             </w:tabs>
             <w:rPr/>
           </w:pPr>
-          <w:hyperlink w:anchor="__RefHeading___Toc1083_3103675090">
+          <w:hyperlink w:anchor="__RefHeading___Toc1084_1415579806">
             <w:r>
               <w:rPr>
                 <w:webHidden/>
@@ -1513,7 +1523,7 @@
             </w:rPr>
             <w:fldChar w:fldCharType="separate"/>
           </w:r>
-          <w:hyperlink w:anchor="__RefHeading___Toc1087_3103675090">
+          <w:hyperlink w:anchor="__RefHeading___Toc1088_1415579806">
             <w:bookmarkStart w:id="11" w:name="índice-de-figuras"/>
             <w:bookmarkEnd w:id="11"/>
             <w:r>
@@ -1549,7 +1559,7 @@
             </w:tabs>
             <w:rPr/>
           </w:pPr>
-          <w:hyperlink w:anchor="__RefHeading___Toc1091_3103675090">
+          <w:hyperlink w:anchor="__RefHeading___Toc1092_1415579806">
             <w:r>
               <w:rPr>
                 <w:webHidden/>
@@ -1583,7 +1593,7 @@
             </w:tabs>
             <w:rPr/>
           </w:pPr>
-          <w:hyperlink w:anchor="__RefHeading___Toc1089_3103675090">
+          <w:hyperlink w:anchor="__RefHeading___Toc1090_1415579806">
             <w:r>
               <w:rPr>
                 <w:webHidden/>
@@ -1629,7 +1639,7 @@
       <w:r>
         <w:br w:type="page"/>
       </w:r>
-      <w:bookmarkStart w:id="12" w:name="__RefHeading___Toc1021_3103675090"/>
+      <w:bookmarkStart w:id="12" w:name="__RefHeading___Toc1022_1415579806"/>
       <w:bookmarkStart w:id="13" w:name="introducción"/>
       <w:bookmarkEnd w:id="12"/>
       <w:r>
@@ -1648,7 +1658,7 @@
         <w:jc w:val="left"/>
         <w:rPr/>
       </w:pPr>
-      <w:bookmarkStart w:id="14" w:name="__RefHeading___Toc1023_3103675090"/>
+      <w:bookmarkStart w:id="14" w:name="__RefHeading___Toc1024_1415579806"/>
       <w:bookmarkStart w:id="15" w:name="justificación-del-tema-elegido"/>
       <w:bookmarkEnd w:id="14"/>
       <w:r>
@@ -1719,7 +1729,7 @@
         <w:jc w:val="left"/>
         <w:rPr/>
       </w:pPr>
-      <w:bookmarkStart w:id="17" w:name="__RefHeading___Toc1025_3103675090"/>
+      <w:bookmarkStart w:id="17" w:name="__RefHeading___Toc1026_1415579806"/>
       <w:bookmarkStart w:id="18" w:name="problema-y-finalidad-del-trabajo"/>
       <w:bookmarkEnd w:id="17"/>
       <w:r>
@@ -1770,7 +1780,7 @@
         <w:jc w:val="left"/>
         <w:rPr/>
       </w:pPr>
-      <w:bookmarkStart w:id="20" w:name="__RefHeading___Toc1027_3103675090"/>
+      <w:bookmarkStart w:id="20" w:name="__RefHeading___Toc1028_1415579806"/>
       <w:bookmarkStart w:id="21" w:name="objetivos-del-tfe"/>
       <w:bookmarkEnd w:id="20"/>
       <w:r>
@@ -1885,7 +1895,7 @@
         <w:jc w:val="left"/>
         <w:rPr/>
       </w:pPr>
-      <w:bookmarkStart w:id="24" w:name="__RefHeading___Toc1029_3103675090"/>
+      <w:bookmarkStart w:id="24" w:name="__RefHeading___Toc1030_1415579806"/>
       <w:bookmarkStart w:id="25" w:name="marco-teórico"/>
       <w:bookmarkEnd w:id="24"/>
       <w:r>
@@ -1914,7 +1924,7 @@
         <w:jc w:val="left"/>
         <w:rPr/>
       </w:pPr>
-      <w:bookmarkStart w:id="26" w:name="__RefHeading___Toc1031_3103675090"/>
+      <w:bookmarkStart w:id="26" w:name="__RefHeading___Toc1032_1415579806"/>
       <w:bookmarkStart w:id="27" w:name="X60eef954ee963db59654a381d5bee5ab339717d"/>
       <w:bookmarkEnd w:id="26"/>
       <w:r>
@@ -2037,7 +2047,7 @@
         <w:pStyle w:val="Figuras"/>
         <w:rPr/>
       </w:pPr>
-      <w:bookmarkStart w:id="28" w:name="__RefHeading___Toc1087_3103675090"/>
+      <w:bookmarkStart w:id="28" w:name="__RefHeading___Toc1088_1415579806"/>
       <w:bookmarkEnd w:id="28"/>
       <w:r>
         <w:rPr>
@@ -2134,7 +2144,7 @@
         <w:jc w:val="left"/>
         <w:rPr/>
       </w:pPr>
-      <w:bookmarkStart w:id="29" w:name="__RefHeading___Toc1033_3103675090"/>
+      <w:bookmarkStart w:id="29" w:name="__RefHeading___Toc1034_1415579806"/>
       <w:bookmarkStart w:id="30" w:name="coherencia-como-variable-educativa"/>
       <w:bookmarkEnd w:id="29"/>
       <w:r>
@@ -2245,7 +2255,7 @@
         <w:jc w:val="left"/>
         <w:rPr/>
       </w:pPr>
-      <w:bookmarkStart w:id="32" w:name="__RefHeading___Toc1035_3103675090"/>
+      <w:bookmarkStart w:id="32" w:name="__RefHeading___Toc1036_1415579806"/>
       <w:bookmarkStart w:id="33" w:name="X1c27a951722c8a4140b142771fc8eedef541425"/>
       <w:bookmarkEnd w:id="32"/>
       <w:r>
@@ -2376,7 +2386,7 @@
         <w:jc w:val="left"/>
         <w:rPr/>
       </w:pPr>
-      <w:bookmarkStart w:id="35" w:name="__RefHeading___Toc1037_3103675090"/>
+      <w:bookmarkStart w:id="35" w:name="__RefHeading___Toc1038_1415579806"/>
       <w:bookmarkStart w:id="36" w:name="X8511c50ea05c053f4af2210ff71dc45263e0551"/>
       <w:bookmarkEnd w:id="35"/>
       <w:r>
@@ -2451,7 +2461,7 @@
         <w:jc w:val="left"/>
         <w:rPr/>
       </w:pPr>
-      <w:bookmarkStart w:id="39" w:name="__RefHeading___Toc1039_3103675090"/>
+      <w:bookmarkStart w:id="39" w:name="__RefHeading___Toc1040_1415579806"/>
       <w:bookmarkStart w:id="40" w:name="metodología"/>
       <w:bookmarkEnd w:id="39"/>
       <w:r>
@@ -2480,7 +2490,7 @@
         <w:jc w:val="left"/>
         <w:rPr/>
       </w:pPr>
-      <w:bookmarkStart w:id="41" w:name="__RefHeading___Toc1041_3103675090"/>
+      <w:bookmarkStart w:id="41" w:name="__RefHeading___Toc1042_1415579806"/>
       <w:bookmarkStart w:id="42" w:name="objetivos"/>
       <w:bookmarkEnd w:id="41"/>
       <w:r>
@@ -2578,7 +2588,7 @@
         <w:jc w:val="left"/>
         <w:rPr/>
       </w:pPr>
-      <w:bookmarkStart w:id="44" w:name="__RefHeading___Toc1043_3103675090"/>
+      <w:bookmarkStart w:id="44" w:name="__RefHeading___Toc1044_1415579806"/>
       <w:bookmarkStart w:id="45" w:name="hipótesis"/>
       <w:bookmarkEnd w:id="44"/>
       <w:r>
@@ -2759,7 +2769,7 @@
         <w:jc w:val="left"/>
         <w:rPr/>
       </w:pPr>
-      <w:bookmarkStart w:id="47" w:name="__RefHeading___Toc1045_3103675090"/>
+      <w:bookmarkStart w:id="47" w:name="__RefHeading___Toc1046_1415579806"/>
       <w:bookmarkStart w:id="48" w:name="población-muestra-y-muestreo"/>
       <w:bookmarkEnd w:id="47"/>
       <w:r>
@@ -2830,7 +2840,7 @@
         <w:jc w:val="left"/>
         <w:rPr/>
       </w:pPr>
-      <w:bookmarkStart w:id="50" w:name="__RefHeading___Toc1047_3103675090"/>
+      <w:bookmarkStart w:id="50" w:name="__RefHeading___Toc1048_1415579806"/>
       <w:bookmarkStart w:id="51" w:name="diseño"/>
       <w:bookmarkEnd w:id="50"/>
       <w:r>
@@ -2871,7 +2881,7 @@
         <w:jc w:val="left"/>
         <w:rPr/>
       </w:pPr>
-      <w:bookmarkStart w:id="53" w:name="__RefHeading___Toc1049_3103675090"/>
+      <w:bookmarkStart w:id="53" w:name="__RefHeading___Toc1050_1415579806"/>
       <w:bookmarkStart w:id="54" w:name="X3a956a43d3fff45f1d8784db15cb28b06e0698e"/>
       <w:bookmarkEnd w:id="53"/>
       <w:r>
@@ -2900,7 +2910,7 @@
         <w:jc w:val="left"/>
         <w:rPr/>
       </w:pPr>
-      <w:bookmarkStart w:id="55" w:name="__RefHeading___Toc1051_3103675090"/>
+      <w:bookmarkStart w:id="55" w:name="__RefHeading___Toc1052_1415579806"/>
       <w:bookmarkStart w:id="56" w:name="X53b0e150eaed7000365d1fe9d50ed396c8d43ba"/>
       <w:bookmarkEnd w:id="55"/>
       <w:r>
@@ -2971,7 +2981,7 @@
         <w:jc w:val="left"/>
         <w:rPr/>
       </w:pPr>
-      <w:bookmarkStart w:id="58" w:name="__RefHeading___Toc1053_3103675090"/>
+      <w:bookmarkStart w:id="58" w:name="__RefHeading___Toc1054_1415579806"/>
       <w:bookmarkStart w:id="59" w:name="X529bf525ae87247c1f779f52131370f0f62662c"/>
       <w:bookmarkEnd w:id="58"/>
       <w:r>
@@ -3022,7 +3032,7 @@
         <w:jc w:val="left"/>
         <w:rPr/>
       </w:pPr>
-      <w:bookmarkStart w:id="61" w:name="__RefHeading___Toc1055_3103675090"/>
+      <w:bookmarkStart w:id="61" w:name="__RefHeading___Toc1056_1415579806"/>
       <w:bookmarkStart w:id="62" w:name="variable-de-control"/>
       <w:bookmarkEnd w:id="61"/>
       <w:r>
@@ -3053,7 +3063,7 @@
         <w:jc w:val="left"/>
         <w:rPr/>
       </w:pPr>
-      <w:bookmarkStart w:id="64" w:name="__RefHeading___Toc1057_3103675090"/>
+      <w:bookmarkStart w:id="64" w:name="__RefHeading___Toc1058_1415579806"/>
       <w:bookmarkStart w:id="65" w:name="descripción-del-instrumento-bozgorailua"/>
       <w:bookmarkEnd w:id="64"/>
       <w:r>
@@ -3106,7 +3116,7 @@
         <w:pStyle w:val="Figuras"/>
         <w:rPr/>
       </w:pPr>
-      <w:bookmarkStart w:id="66" w:name="__RefHeading___Toc1091_3103675090"/>
+      <w:bookmarkStart w:id="66" w:name="__RefHeading___Toc1092_1415579806"/>
       <w:bookmarkEnd w:id="66"/>
       <w:r>
         <w:rPr>
@@ -3196,7 +3206,7 @@
         <w:pStyle w:val="Figuras"/>
         <w:rPr/>
       </w:pPr>
-      <w:bookmarkStart w:id="67" w:name="__RefHeading___Toc1089_3103675090"/>
+      <w:bookmarkStart w:id="67" w:name="__RefHeading___Toc1090_1415579806"/>
       <w:bookmarkEnd w:id="67"/>
       <w:r>
         <w:rPr>
@@ -3294,7 +3304,7 @@
         <w:jc w:val="left"/>
         <w:rPr/>
       </w:pPr>
-      <w:bookmarkStart w:id="68" w:name="__RefHeading___Toc1059_3103675090"/>
+      <w:bookmarkStart w:id="68" w:name="__RefHeading___Toc1060_1415579806"/>
       <w:bookmarkStart w:id="69" w:name="procedimiento-y-cronograma"/>
       <w:bookmarkEnd w:id="68"/>
       <w:r>
@@ -3367,7 +3377,7 @@
         <w:pStyle w:val="TtulodeTDC"/>
         <w:rPr/>
       </w:pPr>
-      <w:bookmarkStart w:id="70" w:name="__RefHeading___Toc1081_3103675090"/>
+      <w:bookmarkStart w:id="70" w:name="__RefHeading___Toc1082_1415579806"/>
       <w:bookmarkEnd w:id="70"/>
       <w:r>
         <w:rPr>
@@ -3826,7 +3836,7 @@
         <w:jc w:val="left"/>
         <w:rPr/>
       </w:pPr>
-      <w:bookmarkStart w:id="71" w:name="__RefHeading___Toc1061_3103675090"/>
+      <w:bookmarkStart w:id="71" w:name="__RefHeading___Toc1062_1415579806"/>
       <w:bookmarkStart w:id="72" w:name="análisis-de-datos"/>
       <w:bookmarkEnd w:id="71"/>
       <w:r>
@@ -3907,7 +3917,7 @@
         <w:jc w:val="left"/>
         <w:rPr/>
       </w:pPr>
-      <w:bookmarkStart w:id="74" w:name="__RefHeading___Toc1063_3103675090"/>
+      <w:bookmarkStart w:id="74" w:name="__RefHeading___Toc1064_1415579806"/>
       <w:bookmarkStart w:id="75" w:name="recursos-humanos-materiales-y-económicos"/>
       <w:bookmarkEnd w:id="74"/>
       <w:r>
@@ -3950,7 +3960,7 @@
         <w:pStyle w:val="TtulodeTDC"/>
         <w:rPr/>
       </w:pPr>
-      <w:bookmarkStart w:id="76" w:name="__RefHeading___Toc1085_3103675090"/>
+      <w:bookmarkStart w:id="76" w:name="__RefHeading___Toc1086_1415579806"/>
       <w:bookmarkEnd w:id="76"/>
       <w:r>
         <w:rPr>
@@ -4522,7 +4532,7 @@
         <w:jc w:val="left"/>
         <w:rPr/>
       </w:pPr>
-      <w:bookmarkStart w:id="77" w:name="__RefHeading___Toc1065_3103675090"/>
+      <w:bookmarkStart w:id="77" w:name="__RefHeading___Toc1066_1415579806"/>
       <w:bookmarkStart w:id="78" w:name="discusión-y-conclusiones"/>
       <w:bookmarkEnd w:id="77"/>
       <w:r>
@@ -4541,7 +4551,7 @@
         <w:jc w:val="left"/>
         <w:rPr/>
       </w:pPr>
-      <w:bookmarkStart w:id="79" w:name="__RefHeading___Toc1067_3103675090"/>
+      <w:bookmarkStart w:id="79" w:name="__RefHeading___Toc1068_1415579806"/>
       <w:bookmarkStart w:id="80" w:name="discusión"/>
       <w:bookmarkEnd w:id="79"/>
       <w:r>
@@ -4682,7 +4692,7 @@
         <w:jc w:val="left"/>
         <w:rPr/>
       </w:pPr>
-      <w:bookmarkStart w:id="82" w:name="__RefHeading___Toc1069_3103675090"/>
+      <w:bookmarkStart w:id="82" w:name="__RefHeading___Toc1070_1415579806"/>
       <w:bookmarkStart w:id="83" w:name="conclusiones-esperadas"/>
       <w:bookmarkEnd w:id="82"/>
       <w:r>
@@ -4763,7 +4773,7 @@
         <w:jc w:val="left"/>
         <w:rPr/>
       </w:pPr>
-      <w:bookmarkStart w:id="85" w:name="__RefHeading___Toc1071_3103675090"/>
+      <w:bookmarkStart w:id="85" w:name="__RefHeading___Toc1072_1415579806"/>
       <w:bookmarkStart w:id="86" w:name="limitaciones-esperadas"/>
       <w:bookmarkEnd w:id="85"/>
       <w:r>
@@ -4864,7 +4874,7 @@
         <w:jc w:val="left"/>
         <w:rPr/>
       </w:pPr>
-      <w:bookmarkStart w:id="88" w:name="__RefHeading___Toc1073_3103675090"/>
+      <w:bookmarkStart w:id="88" w:name="__RefHeading___Toc1074_1415579806"/>
       <w:bookmarkStart w:id="89" w:name="prospectiva"/>
       <w:bookmarkEnd w:id="88"/>
       <w:r>
@@ -4966,7 +4976,7 @@
         <w:jc w:val="left"/>
         <w:rPr/>
       </w:pPr>
-      <w:bookmarkStart w:id="92" w:name="__RefHeading___Toc1075_3103675090"/>
+      <w:bookmarkStart w:id="92" w:name="__RefHeading___Toc1076_1415579806"/>
       <w:bookmarkStart w:id="93" w:name="referencias-bibliográficas"/>
       <w:bookmarkEnd w:id="92"/>
       <w:r>
@@ -5542,7 +5552,7 @@
         <w:jc w:val="left"/>
         <w:rPr/>
       </w:pPr>
-      <w:bookmarkStart w:id="95" w:name="__RefHeading___Toc1077_3103675090"/>
+      <w:bookmarkStart w:id="95" w:name="__RefHeading___Toc1078_1415579806"/>
       <w:bookmarkStart w:id="96" w:name="X3f59ff05da0d932cdd3b48de5b657bf5864e647"/>
       <w:bookmarkEnd w:id="95"/>
       <w:r>
@@ -5575,7 +5585,7 @@
         <w:pStyle w:val="TtulodeTDC"/>
         <w:rPr/>
       </w:pPr>
-      <w:bookmarkStart w:id="97" w:name="__RefHeading___Toc1083_3103675090"/>
+      <w:bookmarkStart w:id="97" w:name="__RefHeading___Toc1084_1415579806"/>
       <w:bookmarkEnd w:id="97"/>
       <w:r>
         <w:rPr>
@@ -6717,7 +6727,7 @@
         <w:jc w:val="left"/>
         <w:rPr/>
       </w:pPr>
-      <w:bookmarkStart w:id="99" w:name="__RefHeading___Toc1079_3103675090"/>
+      <w:bookmarkStart w:id="99" w:name="__RefHeading___Toc1080_1415579806"/>
       <w:bookmarkStart w:id="100" w:name="X31faa7cbfa654f8c712f82bf6245e14c5df2b7b"/>
       <w:bookmarkEnd w:id="99"/>
       <w:r>

</xml_diff>